<commit_message>
vault backup: 2026-10-11 18:32:22
</commit_message>
<xml_diff>
--- a/Visa/801 - Permanent Residency/Prepared Documents/Scott Relationship Statement 801 Initial Draft.docx
+++ b/Visa/801 - Permanent Residency/Prepared Documents/Scott Relationship Statement 801 Initial Draft.docx
@@ -307,6 +307,8 @@
                 <w:szCs w:val="20"/>
                 <w:u w:val="single"/>
               </w:rPr>
+              <w:spacing w:after="120" w:before="160"/>
+              <w:keepNext/>
             </w:pPr>
             <w:r>
               <w:rPr>
@@ -328,6 +330,7 @@
                 <w:sz w:val="20"/>
                 <w:szCs w:val="20"/>
               </w:rPr>
+              <w:spacing w:after="120"/>
             </w:pPr>
             <w:r>
               <w:rPr>
@@ -347,6 +350,7 @@
                 <w:sz w:val="20"/>
                 <w:szCs w:val="20"/>
               </w:rPr>
+              <w:spacing w:after="120"/>
             </w:pPr>
             <w:r>
               <w:rPr>
@@ -366,6 +370,7 @@
                 <w:sz w:val="20"/>
                 <w:szCs w:val="20"/>
               </w:rPr>
+              <w:spacing w:after="120"/>
             </w:pPr>
             <w:r>
               <w:rPr>
@@ -385,6 +390,7 @@
                 <w:sz w:val="20"/>
                 <w:szCs w:val="20"/>
               </w:rPr>
+              <w:spacing w:after="120"/>
             </w:pPr>
             <w:r>
               <w:rPr>
@@ -405,6 +411,8 @@
                 <w:szCs w:val="20"/>
                 <w:u w:val="single"/>
               </w:rPr>
+              <w:spacing w:after="120" w:before="160"/>
+              <w:keepNext/>
             </w:pPr>
             <w:r>
               <w:rPr>
@@ -426,6 +434,7 @@
                 <w:sz w:val="20"/>
                 <w:szCs w:val="20"/>
               </w:rPr>
+              <w:spacing w:after="120"/>
             </w:pPr>
             <w:r>
               <w:rPr>
@@ -445,6 +454,7 @@
                 <w:sz w:val="20"/>
                 <w:szCs w:val="20"/>
               </w:rPr>
+              <w:spacing w:after="120"/>
             </w:pPr>
             <w:r>
               <w:rPr>
@@ -464,6 +474,7 @@
                 <w:sz w:val="20"/>
                 <w:szCs w:val="20"/>
               </w:rPr>
+              <w:spacing w:after="120"/>
             </w:pPr>
             <w:r>
               <w:rPr>
@@ -483,6 +494,7 @@
                 <w:sz w:val="20"/>
                 <w:szCs w:val="20"/>
               </w:rPr>
+              <w:spacing w:after="120"/>
             </w:pPr>
             <w:r>
               <w:rPr>
@@ -502,6 +514,7 @@
                 <w:sz w:val="20"/>
                 <w:szCs w:val="20"/>
               </w:rPr>
+              <w:spacing w:after="120"/>
             </w:pPr>
             <w:r>
               <w:rPr>
@@ -522,6 +535,8 @@
                 <w:szCs w:val="20"/>
                 <w:u w:val="single"/>
               </w:rPr>
+              <w:spacing w:after="120" w:before="160"/>
+              <w:keepNext/>
             </w:pPr>
             <w:r>
               <w:rPr>
@@ -543,6 +558,7 @@
                 <w:sz w:val="20"/>
                 <w:szCs w:val="20"/>
               </w:rPr>
+              <w:spacing w:after="120"/>
             </w:pPr>
             <w:r>
               <w:rPr>
@@ -562,6 +578,7 @@
                 <w:sz w:val="20"/>
                 <w:szCs w:val="20"/>
               </w:rPr>
+              <w:spacing w:after="120"/>
             </w:pPr>
             <w:r>
               <w:rPr>
@@ -581,6 +598,7 @@
                 <w:sz w:val="20"/>
                 <w:szCs w:val="20"/>
               </w:rPr>
+              <w:spacing w:after="120"/>
             </w:pPr>
             <w:r>
               <w:rPr>
@@ -601,6 +619,8 @@
                 <w:szCs w:val="20"/>
                 <w:u w:val="single"/>
               </w:rPr>
+              <w:spacing w:after="120" w:before="160"/>
+              <w:keepNext/>
             </w:pPr>
             <w:r>
               <w:rPr>
@@ -622,6 +642,7 @@
                 <w:sz w:val="20"/>
                 <w:szCs w:val="20"/>
               </w:rPr>
+              <w:spacing w:after="120"/>
             </w:pPr>
             <w:r>
               <w:rPr>
@@ -641,6 +662,7 @@
                 <w:sz w:val="20"/>
                 <w:szCs w:val="20"/>
               </w:rPr>
+              <w:spacing w:after="120"/>
             </w:pPr>
             <w:r>
               <w:rPr>
@@ -660,6 +682,7 @@
                 <w:sz w:val="20"/>
                 <w:szCs w:val="20"/>
               </w:rPr>
+              <w:spacing w:after="120"/>
             </w:pPr>
             <w:r>
               <w:rPr>
@@ -679,6 +702,7 @@
                 <w:sz w:val="20"/>
                 <w:szCs w:val="20"/>
               </w:rPr>
+              <w:spacing w:after="120"/>
             </w:pPr>
             <w:r>
               <w:rPr>
@@ -699,6 +723,8 @@
                 <w:szCs w:val="20"/>
                 <w:u w:val="single"/>
               </w:rPr>
+              <w:spacing w:after="120" w:before="160"/>
+              <w:keepNext/>
             </w:pPr>
             <w:r>
               <w:rPr>
@@ -720,6 +746,7 @@
                 <w:sz w:val="20"/>
                 <w:szCs w:val="20"/>
               </w:rPr>
+              <w:spacing w:after="120"/>
             </w:pPr>
             <w:r>
               <w:rPr>
@@ -739,6 +766,7 @@
                 <w:sz w:val="20"/>
                 <w:szCs w:val="20"/>
               </w:rPr>
+              <w:spacing w:after="120"/>
             </w:pPr>
             <w:r>
               <w:rPr>
@@ -758,6 +786,7 @@
                 <w:sz w:val="20"/>
                 <w:szCs w:val="20"/>
               </w:rPr>
+              <w:spacing w:after="120"/>
             </w:pPr>
             <w:r>
               <w:rPr>
@@ -777,6 +806,7 @@
                 <w:sz w:val="20"/>
                 <w:szCs w:val="20"/>
               </w:rPr>
+              <w:spacing w:after="120"/>
             </w:pPr>
             <w:r>
               <w:rPr>
@@ -797,6 +827,8 @@
                 <w:szCs w:val="20"/>
                 <w:u w:val="single"/>
               </w:rPr>
+              <w:spacing w:after="120" w:before="160"/>
+              <w:keepNext/>
             </w:pPr>
             <w:r>
               <w:rPr>
@@ -818,6 +850,7 @@
                 <w:sz w:val="20"/>
                 <w:szCs w:val="20"/>
               </w:rPr>
+              <w:spacing w:after="120"/>
             </w:pPr>
             <w:r>
               <w:rPr>
@@ -837,6 +870,7 @@
                 <w:sz w:val="20"/>
                 <w:szCs w:val="20"/>
               </w:rPr>
+              <w:spacing w:after="120"/>
             </w:pPr>
             <w:r>
               <w:rPr>
@@ -856,6 +890,7 @@
                 <w:sz w:val="20"/>
                 <w:szCs w:val="20"/>
               </w:rPr>
+              <w:spacing w:after="120"/>
             </w:pPr>
             <w:r>
               <w:rPr>
@@ -876,6 +911,8 @@
                 <w:szCs w:val="20"/>
                 <w:u w:val="single"/>
               </w:rPr>
+              <w:spacing w:after="120" w:before="160"/>
+              <w:keepNext/>
             </w:pPr>
             <w:r>
               <w:rPr>
@@ -897,6 +934,7 @@
                 <w:sz w:val="20"/>
                 <w:szCs w:val="20"/>
               </w:rPr>
+              <w:spacing w:after="120"/>
             </w:pPr>
             <w:r>
               <w:rPr>
@@ -916,6 +954,7 @@
                 <w:sz w:val="20"/>
                 <w:szCs w:val="20"/>
               </w:rPr>
+              <w:spacing w:after="120"/>
             </w:pPr>
             <w:r>
               <w:rPr>
@@ -935,6 +974,7 @@
                 <w:sz w:val="20"/>
                 <w:szCs w:val="20"/>
               </w:rPr>
+              <w:spacing w:after="120"/>
             </w:pPr>
             <w:r>
               <w:rPr>
@@ -954,6 +994,7 @@
                 <w:sz w:val="20"/>
                 <w:szCs w:val="20"/>
               </w:rPr>
+              <w:spacing w:after="120"/>
             </w:pPr>
             <w:r>
               <w:rPr>

</xml_diff>

<commit_message>
vault backup: 2026-10-11 18:33:28
</commit_message>
<xml_diff>
--- a/Visa/801 - Permanent Residency/Prepared Documents/Scott Relationship Statement 801 Initial Draft.docx
+++ b/Visa/801 - Permanent Residency/Prepared Documents/Scott Relationship Statement 801 Initial Draft.docx
@@ -159,9 +159,9 @@
             <w:r>
               <w:rPr>
                 <w:rFonts w:ascii="Arial" w:eastAsia="Arial" w:hAnsi="Arial" w:cs="Arial"/>
-                <w:color w:val="EE0000"/>
-                <w:sz w:val="20"/>
-                <w:szCs w:val="20"/>
+                <w:sz w:val="20"/>
+                <w:szCs w:val="20"/>
+                <w:color w:val="000000"/>
               </w:rPr>
               <w:t>8/4 Prince Street, Coffs Harbour, NSW 2450</w:t>
             </w:r>
@@ -397,6 +397,7 @@
                 <w:rFonts w:ascii="Arial" w:eastAsia="Arial" w:hAnsi="Arial" w:cs="Arial"/>
                 <w:sz w:val="20"/>
                 <w:szCs w:val="20"/>
+                <w:color w:val="000000"/>
               </w:rPr>
               <w:t>4.  Our lease at 8/4 Prince Street, Coffs Harbour commenced on 28 July 2025. We have lived there together throughout the period covered by this update, with only our dog as another member of the household. Both this lease and our earlier Urunga lease were in our joint names. We have since signed a further 26-week lease commencing on 27 July 2026 and ending on 25 January 2027.</w:t>
             </w:r>
@@ -995,6 +996,7 @@
                 <w:szCs w:val="20"/>
               </w:rPr>
               <w:spacing w:after="120"/>
+              <w:pageBreakBefore/>
             </w:pPr>
             <w:r>
               <w:rPr>

</xml_diff>

<commit_message>
vault backup: 2026-10-11 18:39:49
</commit_message>
<xml_diff>
--- a/Visa/801 - Permanent Residency/Prepared Documents/Scott Relationship Statement 801 Initial Draft.docx
+++ b/Visa/801 - Permanent Residency/Prepared Documents/Scott Relationship Statement 801 Initial Draft.docx
@@ -307,7 +307,7 @@
                 <w:szCs w:val="20"/>
                 <w:u w:val="single"/>
               </w:rPr>
-              <w:spacing w:after="120" w:before="160"/>
+              <w:spacing w:after="60" w:before="160"/>
               <w:keepNext/>
             </w:pPr>
             <w:r>
@@ -330,7 +330,7 @@
                 <w:sz w:val="20"/>
                 <w:szCs w:val="20"/>
               </w:rPr>
-              <w:spacing w:after="120"/>
+              <w:spacing w:after="60"/>
             </w:pPr>
             <w:r>
               <w:rPr>
@@ -350,7 +350,7 @@
                 <w:sz w:val="20"/>
                 <w:szCs w:val="20"/>
               </w:rPr>
-              <w:spacing w:after="120"/>
+              <w:spacing w:after="60"/>
             </w:pPr>
             <w:r>
               <w:rPr>
@@ -370,7 +370,7 @@
                 <w:sz w:val="20"/>
                 <w:szCs w:val="20"/>
               </w:rPr>
-              <w:spacing w:after="120"/>
+              <w:spacing w:after="60"/>
             </w:pPr>
             <w:r>
               <w:rPr>
@@ -390,7 +390,7 @@
                 <w:sz w:val="20"/>
                 <w:szCs w:val="20"/>
               </w:rPr>
-              <w:spacing w:after="120"/>
+              <w:spacing w:after="60"/>
             </w:pPr>
             <w:r>
               <w:rPr>
@@ -412,7 +412,7 @@
                 <w:szCs w:val="20"/>
                 <w:u w:val="single"/>
               </w:rPr>
-              <w:spacing w:after="120" w:before="160"/>
+              <w:spacing w:after="60" w:before="160"/>
               <w:keepNext/>
             </w:pPr>
             <w:r>
@@ -435,7 +435,7 @@
                 <w:sz w:val="20"/>
                 <w:szCs w:val="20"/>
               </w:rPr>
-              <w:spacing w:after="120"/>
+              <w:spacing w:after="60"/>
             </w:pPr>
             <w:r>
               <w:rPr>
@@ -455,7 +455,7 @@
                 <w:sz w:val="20"/>
                 <w:szCs w:val="20"/>
               </w:rPr>
-              <w:spacing w:after="120"/>
+              <w:spacing w:after="60"/>
             </w:pPr>
             <w:r>
               <w:rPr>
@@ -475,7 +475,7 @@
                 <w:sz w:val="20"/>
                 <w:szCs w:val="20"/>
               </w:rPr>
-              <w:spacing w:after="120"/>
+              <w:spacing w:after="60"/>
             </w:pPr>
             <w:r>
               <w:rPr>
@@ -495,7 +495,7 @@
                 <w:sz w:val="20"/>
                 <w:szCs w:val="20"/>
               </w:rPr>
-              <w:spacing w:after="120"/>
+              <w:spacing w:after="60"/>
             </w:pPr>
             <w:r>
               <w:rPr>
@@ -515,7 +515,7 @@
                 <w:sz w:val="20"/>
                 <w:szCs w:val="20"/>
               </w:rPr>
-              <w:spacing w:after="120"/>
+              <w:spacing w:after="60"/>
             </w:pPr>
             <w:r>
               <w:rPr>
@@ -536,7 +536,7 @@
                 <w:szCs w:val="20"/>
                 <w:u w:val="single"/>
               </w:rPr>
-              <w:spacing w:after="120" w:before="160"/>
+              <w:spacing w:after="60" w:before="160"/>
               <w:keepNext/>
             </w:pPr>
             <w:r>
@@ -559,7 +559,7 @@
                 <w:sz w:val="20"/>
                 <w:szCs w:val="20"/>
               </w:rPr>
-              <w:spacing w:after="120"/>
+              <w:spacing w:after="60"/>
             </w:pPr>
             <w:r>
               <w:rPr>
@@ -579,7 +579,7 @@
                 <w:sz w:val="20"/>
                 <w:szCs w:val="20"/>
               </w:rPr>
-              <w:spacing w:after="120"/>
+              <w:spacing w:after="60"/>
             </w:pPr>
             <w:r>
               <w:rPr>
@@ -599,7 +599,7 @@
                 <w:sz w:val="20"/>
                 <w:szCs w:val="20"/>
               </w:rPr>
-              <w:spacing w:after="120"/>
+              <w:spacing w:after="60"/>
             </w:pPr>
             <w:r>
               <w:rPr>
@@ -620,7 +620,7 @@
                 <w:szCs w:val="20"/>
                 <w:u w:val="single"/>
               </w:rPr>
-              <w:spacing w:after="120" w:before="160"/>
+              <w:spacing w:after="60" w:before="160"/>
               <w:keepNext/>
             </w:pPr>
             <w:r>
@@ -643,7 +643,7 @@
                 <w:sz w:val="20"/>
                 <w:szCs w:val="20"/>
               </w:rPr>
-              <w:spacing w:after="120"/>
+              <w:spacing w:after="60"/>
             </w:pPr>
             <w:r>
               <w:rPr>
@@ -663,7 +663,7 @@
                 <w:sz w:val="20"/>
                 <w:szCs w:val="20"/>
               </w:rPr>
-              <w:spacing w:after="120"/>
+              <w:spacing w:after="60"/>
             </w:pPr>
             <w:r>
               <w:rPr>
@@ -683,7 +683,7 @@
                 <w:sz w:val="20"/>
                 <w:szCs w:val="20"/>
               </w:rPr>
-              <w:spacing w:after="120"/>
+              <w:spacing w:after="60"/>
             </w:pPr>
             <w:r>
               <w:rPr>
@@ -703,7 +703,7 @@
                 <w:sz w:val="20"/>
                 <w:szCs w:val="20"/>
               </w:rPr>
-              <w:spacing w:after="120"/>
+              <w:spacing w:after="60"/>
             </w:pPr>
             <w:r>
               <w:rPr>
@@ -724,7 +724,7 @@
                 <w:szCs w:val="20"/>
                 <w:u w:val="single"/>
               </w:rPr>
-              <w:spacing w:after="120" w:before="160"/>
+              <w:spacing w:after="60" w:before="160"/>
               <w:keepNext/>
             </w:pPr>
             <w:r>
@@ -747,7 +747,7 @@
                 <w:sz w:val="20"/>
                 <w:szCs w:val="20"/>
               </w:rPr>
-              <w:spacing w:after="120"/>
+              <w:spacing w:after="60"/>
             </w:pPr>
             <w:r>
               <w:rPr>
@@ -767,7 +767,7 @@
                 <w:sz w:val="20"/>
                 <w:szCs w:val="20"/>
               </w:rPr>
-              <w:spacing w:after="120"/>
+              <w:spacing w:after="60"/>
             </w:pPr>
             <w:r>
               <w:rPr>
@@ -787,7 +787,7 @@
                 <w:sz w:val="20"/>
                 <w:szCs w:val="20"/>
               </w:rPr>
-              <w:spacing w:after="120"/>
+              <w:spacing w:after="60"/>
             </w:pPr>
             <w:r>
               <w:rPr>
@@ -807,7 +807,7 @@
                 <w:sz w:val="20"/>
                 <w:szCs w:val="20"/>
               </w:rPr>
-              <w:spacing w:after="120"/>
+              <w:spacing w:after="60"/>
             </w:pPr>
             <w:r>
               <w:rPr>
@@ -828,7 +828,7 @@
                 <w:szCs w:val="20"/>
                 <w:u w:val="single"/>
               </w:rPr>
-              <w:spacing w:after="120" w:before="160"/>
+              <w:spacing w:after="60" w:before="160"/>
               <w:keepNext/>
             </w:pPr>
             <w:r>
@@ -851,7 +851,7 @@
                 <w:sz w:val="20"/>
                 <w:szCs w:val="20"/>
               </w:rPr>
-              <w:spacing w:after="120"/>
+              <w:spacing w:after="60"/>
             </w:pPr>
             <w:r>
               <w:rPr>
@@ -871,7 +871,7 @@
                 <w:sz w:val="20"/>
                 <w:szCs w:val="20"/>
               </w:rPr>
-              <w:spacing w:after="120"/>
+              <w:spacing w:after="60"/>
             </w:pPr>
             <w:r>
               <w:rPr>
@@ -891,7 +891,7 @@
                 <w:sz w:val="20"/>
                 <w:szCs w:val="20"/>
               </w:rPr>
-              <w:spacing w:after="120"/>
+              <w:spacing w:after="60"/>
             </w:pPr>
             <w:r>
               <w:rPr>
@@ -912,7 +912,7 @@
                 <w:szCs w:val="20"/>
                 <w:u w:val="single"/>
               </w:rPr>
-              <w:spacing w:after="120" w:before="160"/>
+              <w:spacing w:after="60" w:before="160"/>
               <w:keepNext/>
             </w:pPr>
             <w:r>
@@ -935,7 +935,7 @@
                 <w:sz w:val="20"/>
                 <w:szCs w:val="20"/>
               </w:rPr>
-              <w:spacing w:after="120"/>
+              <w:spacing w:after="60"/>
             </w:pPr>
             <w:r>
               <w:rPr>
@@ -955,7 +955,7 @@
                 <w:sz w:val="20"/>
                 <w:szCs w:val="20"/>
               </w:rPr>
-              <w:spacing w:after="120"/>
+              <w:spacing w:after="60"/>
             </w:pPr>
             <w:r>
               <w:rPr>
@@ -975,7 +975,7 @@
                 <w:sz w:val="20"/>
                 <w:szCs w:val="20"/>
               </w:rPr>
-              <w:spacing w:after="120"/>
+              <w:spacing w:after="60"/>
             </w:pPr>
             <w:r>
               <w:rPr>
@@ -995,8 +995,7 @@
                 <w:sz w:val="20"/>
                 <w:szCs w:val="20"/>
               </w:rPr>
-              <w:spacing w:after="120"/>
-              <w:pageBreakBefore/>
+              <w:spacing w:after="60"/>
             </w:pPr>
             <w:r>
               <w:rPr>

</xml_diff>